<commit_message>
Add Heading 1/2 styles to proceedings DOCX for chapter navigation
Chapter headers now use Word's built-in Heading 1/2 styles alongside the
visual banner tables, making all chapters visible in Word's Navigation Pane
and document outline view (Overview + Chapters 1–7, 276 paragraphs).

https://claude.ai/code/session_016WQM6ThbEcq21sYa9B7dUx
</commit_message>
<xml_diff>
--- a/Workshop_Proceedings_2026.docx
+++ b/Workshop_Proceedings_2026.docx
@@ -814,6 +814,20 @@
         <w:br w:type="page"/>
       </w:r>
     </w:p>
+    <w:p>
+      <w:pPr>
+        <w:pStyle w:val="Heading1"/>
+        <w:spacing w:before="0" w:after="40"/>
+      </w:pPr>
+      <w:r>
+        <w:rPr>
+          <w:rFonts w:ascii="Calibri" w:hAnsi="Calibri"/>
+          <w:color w:val="1B4332"/>
+          <w:sz w:val="28"/>
+        </w:rPr>
+        <w:t>Overview — Workshop Overview &amp; Inaugural Proceedings</w:t>
+      </w:r>
+    </w:p>
     <w:tbl>
       <w:tblPr>
         <w:tblStyle w:val="TableGrid"/>
@@ -884,6 +898,20 @@
       </w:tr>
     </w:tbl>
     <w:p/>
+    <w:p>
+      <w:pPr>
+        <w:pStyle w:val="Heading2"/>
+        <w:spacing w:before="80" w:after="40"/>
+      </w:pPr>
+      <w:r>
+        <w:rPr>
+          <w:rFonts w:ascii="Calibri" w:hAnsi="Calibri"/>
+          <w:color w:val="FFFFFF"/>
+          <w:sz w:val="22"/>
+        </w:rPr>
+        <w:t>1. Workshop at a Glance</w:t>
+      </w:r>
+    </w:p>
     <w:tbl>
       <w:tblPr>
         <w:tblStyle w:val="TableGrid"/>
@@ -1333,6 +1361,20 @@
       </w:tr>
     </w:tbl>
     <w:p/>
+    <w:p>
+      <w:pPr>
+        <w:pStyle w:val="Heading2"/>
+        <w:spacing w:before="80" w:after="40"/>
+      </w:pPr>
+      <w:r>
+        <w:rPr>
+          <w:rFonts w:ascii="Calibri" w:hAnsi="Calibri"/>
+          <w:color w:val="FFFFFF"/>
+          <w:sz w:val="22"/>
+        </w:rPr>
+        <w:t>2. Background &amp; Rationale</w:t>
+      </w:r>
+    </w:p>
     <w:tbl>
       <w:tblPr>
         <w:tblStyle w:val="TableGrid"/>
@@ -1415,6 +1457,20 @@
       </w:tr>
     </w:tbl>
     <w:p/>
+    <w:p>
+      <w:pPr>
+        <w:pStyle w:val="Heading2"/>
+        <w:spacing w:before="80" w:after="40"/>
+      </w:pPr>
+      <w:r>
+        <w:rPr>
+          <w:rFonts w:ascii="Calibri" w:hAnsi="Calibri"/>
+          <w:color w:val="FFFFFF"/>
+          <w:sz w:val="22"/>
+        </w:rPr>
+        <w:t>3. Workshop Objectives</w:t>
+      </w:r>
+    </w:p>
     <w:tbl>
       <w:tblPr>
         <w:tblStyle w:val="TableGrid"/>
@@ -1744,6 +1800,20 @@
       </w:tr>
     </w:tbl>
     <w:p/>
+    <w:p>
+      <w:pPr>
+        <w:pStyle w:val="Heading2"/>
+        <w:spacing w:before="80" w:after="40"/>
+      </w:pPr>
+      <w:r>
+        <w:rPr>
+          <w:rFonts w:ascii="Calibri" w:hAnsi="Calibri"/>
+          <w:color w:val="FFFFFF"/>
+          <w:sz w:val="22"/>
+        </w:rPr>
+        <w:t>4. Resource Persons</w:t>
+      </w:r>
+    </w:p>
     <w:tbl>
       <w:tblPr>
         <w:tblStyle w:val="TableGrid"/>
@@ -2150,6 +2220,20 @@
       </w:tr>
     </w:tbl>
     <w:p/>
+    <w:p>
+      <w:pPr>
+        <w:pStyle w:val="Heading2"/>
+        <w:spacing w:before="80" w:after="40"/>
+      </w:pPr>
+      <w:r>
+        <w:rPr>
+          <w:rFonts w:ascii="Calibri" w:hAnsi="Calibri"/>
+          <w:color w:val="FFFFFF"/>
+          <w:sz w:val="22"/>
+        </w:rPr>
+        <w:t>5. Two-Day Programme Schedule</w:t>
+      </w:r>
+    </w:p>
     <w:tbl>
       <w:tblPr>
         <w:tblStyle w:val="TableGrid"/>
@@ -3213,6 +3297,20 @@
       </w:tr>
     </w:tbl>
     <w:p/>
+    <w:p>
+      <w:pPr>
+        <w:pStyle w:val="Heading2"/>
+        <w:spacing w:before="80" w:after="40"/>
+      </w:pPr>
+      <w:r>
+        <w:rPr>
+          <w:rFonts w:ascii="Calibri" w:hAnsi="Calibri"/>
+          <w:color w:val="FFFFFF"/>
+          <w:sz w:val="22"/>
+        </w:rPr>
+        <w:t>6. Partner Institutions</w:t>
+      </w:r>
+    </w:p>
     <w:tbl>
       <w:tblPr>
         <w:tblStyle w:val="TableGrid"/>
@@ -3560,6 +3658,20 @@
       </w:tr>
     </w:tbl>
     <w:p/>
+    <w:p>
+      <w:pPr>
+        <w:pStyle w:val="Heading2"/>
+        <w:spacing w:before="80" w:after="40"/>
+      </w:pPr>
+      <w:r>
+        <w:rPr>
+          <w:rFonts w:ascii="Calibri" w:hAnsi="Calibri"/>
+          <w:color w:val="FFFFFF"/>
+          <w:sz w:val="22"/>
+        </w:rPr>
+        <w:t>7. Inaugural Address — Forest Minister Shri Kedar Kashyap</w:t>
+      </w:r>
+    </w:p>
     <w:tbl>
       <w:tblPr>
         <w:tblStyle w:val="TableGrid"/>
@@ -3649,6 +3761,20 @@
         <w:br w:type="page"/>
       </w:r>
     </w:p>
+    <w:p>
+      <w:pPr>
+        <w:pStyle w:val="Heading1"/>
+        <w:spacing w:before="0" w:after="40"/>
+      </w:pPr>
+      <w:r>
+        <w:rPr>
+          <w:rFonts w:ascii="Calibri" w:hAnsi="Calibri"/>
+          <w:color w:val="1B4332"/>
+          <w:sz w:val="28"/>
+        </w:rPr>
+        <w:t>Chapter 1 — Elephant Mortality Analysis in Chhattisgarh (2021–2026)</w:t>
+      </w:r>
+    </w:p>
     <w:tbl>
       <w:tblPr>
         <w:tblStyle w:val="TableGrid"/>
@@ -3719,6 +3845,20 @@
       </w:tr>
     </w:tbl>
     <w:p/>
+    <w:p>
+      <w:pPr>
+        <w:pStyle w:val="Heading2"/>
+        <w:spacing w:before="80" w:after="40"/>
+      </w:pPr>
+      <w:r>
+        <w:rPr>
+          <w:rFonts w:ascii="Calibri" w:hAnsi="Calibri"/>
+          <w:color w:val="FFFFFF"/>
+          <w:sz w:val="22"/>
+        </w:rPr>
+        <w:t>1. Elephant Population Status in Chhattisgarh</w:t>
+      </w:r>
+    </w:p>
     <w:tbl>
       <w:tblPr>
         <w:tblStyle w:val="TableGrid"/>
@@ -4262,6 +4402,20 @@
       </w:tr>
     </w:tbl>
     <w:p/>
+    <w:p>
+      <w:pPr>
+        <w:pStyle w:val="Heading2"/>
+        <w:spacing w:before="80" w:after="40"/>
+      </w:pPr>
+      <w:r>
+        <w:rPr>
+          <w:rFonts w:ascii="Calibri" w:hAnsi="Calibri"/>
+          <w:color w:val="FFFFFF"/>
+          <w:sz w:val="22"/>
+        </w:rPr>
+        <w:t>2. Elephant Casualty Analysis (2021–2026)</w:t>
+      </w:r>
+    </w:p>
     <w:tbl>
       <w:tblPr>
         <w:tblStyle w:val="TableGrid"/>
@@ -5150,6 +5304,20 @@
         <w:t>Human deaths in Human-Elephant Conflict: 45 total (DH: 36 | RG: 9)</w:t>
       </w:r>
     </w:p>
+    <w:p>
+      <w:pPr>
+        <w:pStyle w:val="Heading2"/>
+        <w:spacing w:before="80" w:after="40"/>
+      </w:pPr>
+      <w:r>
+        <w:rPr>
+          <w:rFonts w:ascii="Calibri" w:hAnsi="Calibri"/>
+          <w:color w:val="FFFFFF"/>
+          <w:sz w:val="22"/>
+        </w:rPr>
+        <w:t>3. Cause of Death Analysis</w:t>
+      </w:r>
+    </w:p>
     <w:tbl>
       <w:tblPr>
         <w:tblStyle w:val="TableGrid"/>
@@ -5706,6 +5874,20 @@
       </w:tr>
     </w:tbl>
     <w:p/>
+    <w:p>
+      <w:pPr>
+        <w:pStyle w:val="Heading2"/>
+        <w:spacing w:before="80" w:after="40"/>
+      </w:pPr>
+      <w:r>
+        <w:rPr>
+          <w:rFonts w:ascii="Calibri" w:hAnsi="Calibri"/>
+          <w:color w:val="FFFFFF"/>
+          <w:sz w:val="22"/>
+        </w:rPr>
+        <w:t>4. Demographic Analysis</w:t>
+      </w:r>
+    </w:p>
     <w:tbl>
       <w:tblPr>
         <w:tblStyle w:val="TableGrid"/>
@@ -6518,6 +6700,20 @@
       </w:tr>
     </w:tbl>
     <w:p/>
+    <w:p>
+      <w:pPr>
+        <w:pStyle w:val="Heading2"/>
+        <w:spacing w:before="80" w:after="40"/>
+      </w:pPr>
+      <w:r>
+        <w:rPr>
+          <w:rFonts w:ascii="Calibri" w:hAnsi="Calibri"/>
+          <w:color w:val="FFFFFF"/>
+          <w:sz w:val="22"/>
+        </w:rPr>
+        <w:t>5. Seasonal Variation</w:t>
+      </w:r>
+    </w:p>
     <w:tbl>
       <w:tblPr>
         <w:tblStyle w:val="TableGrid"/>
@@ -7084,6 +7280,20 @@
         <w:t>October is the single deadliest month (8 deaths). Oct–Dec = 42% of annual deaths.</w:t>
       </w:r>
     </w:p>
+    <w:p>
+      <w:pPr>
+        <w:pStyle w:val="Heading2"/>
+        <w:spacing w:before="80" w:after="40"/>
+      </w:pPr>
+      <w:r>
+        <w:rPr>
+          <w:rFonts w:ascii="Calibri" w:hAnsi="Calibri"/>
+          <w:color w:val="FFFFFF"/>
+          <w:sz w:val="22"/>
+        </w:rPr>
+        <w:t>6. Range-wise Distribution</w:t>
+      </w:r>
+    </w:p>
     <w:tbl>
       <w:tblPr>
         <w:tblStyle w:val="TableGrid"/>
@@ -8239,6 +8449,20 @@
       </w:tr>
     </w:tbl>
     <w:p/>
+    <w:p>
+      <w:pPr>
+        <w:pStyle w:val="Heading2"/>
+        <w:spacing w:before="80" w:after="40"/>
+      </w:pPr>
+      <w:r>
+        <w:rPr>
+          <w:rFonts w:ascii="Calibri" w:hAnsi="Calibri"/>
+          <w:color w:val="FFFFFF"/>
+          <w:sz w:val="22"/>
+        </w:rPr>
+        <w:t>7. Drowning — Post-Mortem Analysis</w:t>
+      </w:r>
+    </w:p>
     <w:tbl>
       <w:tblPr>
         <w:tblStyle w:val="TableGrid"/>
@@ -8859,6 +9083,20 @@
       </w:tr>
     </w:tbl>
     <w:p/>
+    <w:p>
+      <w:pPr>
+        <w:pStyle w:val="Heading2"/>
+        <w:spacing w:before="80" w:after="40"/>
+      </w:pPr>
+      <w:r>
+        <w:rPr>
+          <w:rFonts w:ascii="Calibri" w:hAnsi="Calibri"/>
+          <w:color w:val="FFFFFF"/>
+          <w:sz w:val="22"/>
+        </w:rPr>
+        <w:t>8. Case Study — Gurda Calf Drowning (01 June 2026)</w:t>
+      </w:r>
+    </w:p>
     <w:tbl>
       <w:tblPr>
         <w:tblStyle w:val="TableGrid"/>
@@ -9270,6 +9508,20 @@
       </w:tr>
     </w:tbl>
     <w:p/>
+    <w:p>
+      <w:pPr>
+        <w:pStyle w:val="Heading2"/>
+        <w:spacing w:before="80" w:after="40"/>
+      </w:pPr>
+      <w:r>
+        <w:rPr>
+          <w:rFonts w:ascii="Calibri" w:hAnsi="Calibri"/>
+          <w:color w:val="FFFFFF"/>
+          <w:sz w:val="22"/>
+        </w:rPr>
+        <w:t>9. Key Recommendations &amp; Priority Action Plan</w:t>
+      </w:r>
+    </w:p>
     <w:tbl>
       <w:tblPr>
         <w:tblStyle w:val="TableGrid"/>
@@ -10035,6 +10287,20 @@
         <w:br w:type="page"/>
       </w:r>
     </w:p>
+    <w:p>
+      <w:pPr>
+        <w:pStyle w:val="Heading1"/>
+        <w:spacing w:before="0" w:after="40"/>
+      </w:pPr>
+      <w:r>
+        <w:rPr>
+          <w:rFonts w:ascii="Calibri" w:hAnsi="Calibri"/>
+          <w:color w:val="1B4332"/>
+          <w:sz w:val="28"/>
+        </w:rPr>
+        <w:t>Chapter 2 — Biological &amp; Anatomical Aspects of the Asian Elephant</w:t>
+      </w:r>
+    </w:p>
     <w:tbl>
       <w:tblPr>
         <w:tblStyle w:val="TableGrid"/>
@@ -10105,6 +10371,20 @@
       </w:tr>
     </w:tbl>
     <w:p/>
+    <w:p>
+      <w:pPr>
+        <w:pStyle w:val="Heading2"/>
+        <w:spacing w:before="80" w:after="40"/>
+      </w:pPr>
+      <w:r>
+        <w:rPr>
+          <w:rFonts w:ascii="Calibri" w:hAnsi="Calibri"/>
+          <w:color w:val="FFFFFF"/>
+          <w:sz w:val="22"/>
+        </w:rPr>
+        <w:t>1. Taxonomy &amp; Classification</w:t>
+      </w:r>
+    </w:p>
     <w:tbl>
       <w:tblPr>
         <w:tblStyle w:val="TableGrid"/>
@@ -10514,6 +10794,20 @@
       </w:tr>
     </w:tbl>
     <w:p/>
+    <w:p>
+      <w:pPr>
+        <w:pStyle w:val="Heading2"/>
+        <w:spacing w:before="80" w:after="40"/>
+      </w:pPr>
+      <w:r>
+        <w:rPr>
+          <w:rFonts w:ascii="Calibri" w:hAnsi="Calibri"/>
+          <w:color w:val="FFFFFF"/>
+          <w:sz w:val="22"/>
+        </w:rPr>
+        <w:t>2. Physical Characteristics — Asian vs African Elephant</w:t>
+      </w:r>
+    </w:p>
     <w:tbl>
       <w:tblPr>
         <w:tblStyle w:val="TableGrid"/>
@@ -11156,6 +11450,20 @@
       </w:tr>
     </w:tbl>
     <w:p/>
+    <w:p>
+      <w:pPr>
+        <w:pStyle w:val="Heading2"/>
+        <w:spacing w:before="80" w:after="40"/>
+      </w:pPr>
+      <w:r>
+        <w:rPr>
+          <w:rFonts w:ascii="Calibri" w:hAnsi="Calibri"/>
+          <w:color w:val="FFFFFF"/>
+          <w:sz w:val="22"/>
+        </w:rPr>
+        <w:t>3. The Trunk — Proboscis</w:t>
+      </w:r>
+    </w:p>
     <w:tbl>
       <w:tblPr>
         <w:tblStyle w:val="TableGrid"/>
@@ -11581,6 +11889,20 @@
       </w:tr>
     </w:tbl>
     <w:p/>
+    <w:p>
+      <w:pPr>
+        <w:pStyle w:val="Heading2"/>
+        <w:spacing w:before="80" w:after="40"/>
+      </w:pPr>
+      <w:r>
+        <w:rPr>
+          <w:rFonts w:ascii="Calibri" w:hAnsi="Calibri"/>
+          <w:color w:val="FFFFFF"/>
+          <w:sz w:val="22"/>
+        </w:rPr>
+        <w:t>4. Molar Teeth &amp; Age Estimation</w:t>
+      </w:r>
+    </w:p>
     <w:tbl>
       <w:tblPr>
         <w:tblStyle w:val="TableGrid"/>
@@ -12231,6 +12553,20 @@
       </w:tr>
     </w:tbl>
     <w:p/>
+    <w:p>
+      <w:pPr>
+        <w:pStyle w:val="Heading2"/>
+        <w:spacing w:before="80" w:after="40"/>
+      </w:pPr>
+      <w:r>
+        <w:rPr>
+          <w:rFonts w:ascii="Calibri" w:hAnsi="Calibri"/>
+          <w:color w:val="FFFFFF"/>
+          <w:sz w:val="22"/>
+        </w:rPr>
+        <w:t>5. Ear Morphology &amp; Thermoregulation</w:t>
+      </w:r>
+    </w:p>
     <w:tbl>
       <w:tblPr>
         <w:tblStyle w:val="TableGrid"/>
@@ -12480,6 +12816,20 @@
       </w:tr>
     </w:tbl>
     <w:p/>
+    <w:p>
+      <w:pPr>
+        <w:pStyle w:val="Heading2"/>
+        <w:spacing w:before="80" w:after="40"/>
+      </w:pPr>
+      <w:r>
+        <w:rPr>
+          <w:rFonts w:ascii="Calibri" w:hAnsi="Calibri"/>
+          <w:color w:val="FFFFFF"/>
+          <w:sz w:val="22"/>
+        </w:rPr>
+        <w:t>6. Digestive System — Hindgut Fermenters</w:t>
+      </w:r>
+    </w:p>
     <w:tbl>
       <w:tblPr>
         <w:tblStyle w:val="TableGrid"/>
@@ -12785,6 +13135,20 @@
       </w:tr>
     </w:tbl>
     <w:p/>
+    <w:p>
+      <w:pPr>
+        <w:pStyle w:val="Heading2"/>
+        <w:spacing w:before="80" w:after="40"/>
+      </w:pPr>
+      <w:r>
+        <w:rPr>
+          <w:rFonts w:ascii="Calibri" w:hAnsi="Calibri"/>
+          <w:color w:val="FFFFFF"/>
+          <w:sz w:val="22"/>
+        </w:rPr>
+        <w:t>7. Reproductive System</w:t>
+      </w:r>
+    </w:p>
     <w:tbl>
       <w:tblPr>
         <w:tblStyle w:val="TableGrid"/>
@@ -13250,6 +13614,20 @@
       </w:tr>
     </w:tbl>
     <w:p/>
+    <w:p>
+      <w:pPr>
+        <w:pStyle w:val="Heading2"/>
+        <w:spacing w:before="80" w:after="40"/>
+      </w:pPr>
+      <w:r>
+        <w:rPr>
+          <w:rFonts w:ascii="Calibri" w:hAnsi="Calibri"/>
+          <w:color w:val="FFFFFF"/>
+          <w:sz w:val="22"/>
+        </w:rPr>
+        <w:t>8. Sensory Capabilities</w:t>
+      </w:r>
+    </w:p>
     <w:tbl>
       <w:tblPr>
         <w:tblStyle w:val="TableGrid"/>
@@ -13547,6 +13925,20 @@
         <w:br w:type="page"/>
       </w:r>
     </w:p>
+    <w:p>
+      <w:pPr>
+        <w:pStyle w:val="Heading1"/>
+        <w:spacing w:before="0" w:after="40"/>
+      </w:pPr>
+      <w:r>
+        <w:rPr>
+          <w:rFonts w:ascii="Calibri" w:hAnsi="Calibri"/>
+          <w:color w:val="1B4332"/>
+          <w:sz w:val="28"/>
+        </w:rPr>
+        <w:t>Chapter 3 — Infectious Diseases of Asian Elephants</w:t>
+      </w:r>
+    </w:p>
     <w:tbl>
       <w:tblPr>
         <w:tblStyle w:val="TableGrid"/>
@@ -13617,6 +14009,20 @@
       </w:tr>
     </w:tbl>
     <w:p/>
+    <w:p>
+      <w:pPr>
+        <w:pStyle w:val="Heading2"/>
+        <w:spacing w:before="80" w:after="40"/>
+      </w:pPr>
+      <w:r>
+        <w:rPr>
+          <w:rFonts w:ascii="Calibri" w:hAnsi="Calibri"/>
+          <w:color w:val="FFFFFF"/>
+          <w:sz w:val="22"/>
+        </w:rPr>
+        <w:t>1. Introduction</w:t>
+      </w:r>
+    </w:p>
     <w:tbl>
       <w:tblPr>
         <w:tblStyle w:val="TableGrid"/>
@@ -13666,6 +14072,20 @@
         <w:t>Infectious diseases are a growing threat to Asian elephant conservation. Both captive and wild populations face viral, bacterial, and parasitic pathogens. Many are zoonotic, posing risk to handlers and veterinary staff. Systematic necropsy, sampling, and laboratory diagnosis are essential for identifying and managing these threats.</w:t>
       </w:r>
     </w:p>
+    <w:p>
+      <w:pPr>
+        <w:pStyle w:val="Heading2"/>
+        <w:spacing w:before="80" w:after="40"/>
+      </w:pPr>
+      <w:r>
+        <w:rPr>
+          <w:rFonts w:ascii="Calibri" w:hAnsi="Calibri"/>
+          <w:color w:val="FFFFFF"/>
+          <w:sz w:val="22"/>
+        </w:rPr>
+        <w:t>2. EEHV — Elephant Endotheliotropic Herpesvirus (MOST FATAL)</w:t>
+      </w:r>
+    </w:p>
     <w:tbl>
       <w:tblPr>
         <w:tblStyle w:val="TableGrid"/>
@@ -14188,6 +14608,20 @@
       </w:tr>
     </w:tbl>
     <w:p/>
+    <w:p>
+      <w:pPr>
+        <w:pStyle w:val="Heading2"/>
+        <w:spacing w:before="80" w:after="40"/>
+      </w:pPr>
+      <w:r>
+        <w:rPr>
+          <w:rFonts w:ascii="Calibri" w:hAnsi="Calibri"/>
+          <w:color w:val="FFFFFF"/>
+          <w:sz w:val="22"/>
+        </w:rPr>
+        <w:t>3. Tuberculosis (TB) — Mycobacterium tuberculosis</w:t>
+      </w:r>
+    </w:p>
     <w:tbl>
       <w:tblPr>
         <w:tblStyle w:val="TableGrid"/>
@@ -14630,6 +15064,20 @@
       </w:tr>
     </w:tbl>
     <w:p/>
+    <w:p>
+      <w:pPr>
+        <w:pStyle w:val="Heading2"/>
+        <w:spacing w:before="80" w:after="40"/>
+      </w:pPr>
+      <w:r>
+        <w:rPr>
+          <w:rFonts w:ascii="Calibri" w:hAnsi="Calibri"/>
+          <w:color w:val="FFFFFF"/>
+          <w:sz w:val="22"/>
+        </w:rPr>
+        <w:t>4. Anthrax — Bacillus anthracis</w:t>
+      </w:r>
+    </w:p>
     <w:tbl>
       <w:tblPr>
         <w:tblStyle w:val="TableGrid"/>
@@ -14912,6 +15360,20 @@
       </w:tr>
     </w:tbl>
     <w:p/>
+    <w:p>
+      <w:pPr>
+        <w:pStyle w:val="Heading2"/>
+        <w:spacing w:before="80" w:after="40"/>
+      </w:pPr>
+      <w:r>
+        <w:rPr>
+          <w:rFonts w:ascii="Calibri" w:hAnsi="Calibri"/>
+          <w:color w:val="FFFFFF"/>
+          <w:sz w:val="22"/>
+        </w:rPr>
+        <w:t>5. Other Bacterial Diseases</w:t>
+      </w:r>
+    </w:p>
     <w:tbl>
       <w:tblPr>
         <w:tblStyle w:val="TableGrid"/>
@@ -15259,6 +15721,20 @@
       </w:tr>
     </w:tbl>
     <w:p/>
+    <w:p>
+      <w:pPr>
+        <w:pStyle w:val="Heading2"/>
+        <w:spacing w:before="80" w:after="40"/>
+      </w:pPr>
+      <w:r>
+        <w:rPr>
+          <w:rFonts w:ascii="Calibri" w:hAnsi="Calibri"/>
+          <w:color w:val="FFFFFF"/>
+          <w:sz w:val="22"/>
+        </w:rPr>
+        <w:t>6. Viral Diseases — Other</w:t>
+      </w:r>
+    </w:p>
     <w:tbl>
       <w:tblPr>
         <w:tblStyle w:val="TableGrid"/>
@@ -15704,6 +16180,20 @@
       </w:tr>
     </w:tbl>
     <w:p/>
+    <w:p>
+      <w:pPr>
+        <w:pStyle w:val="Heading2"/>
+        <w:spacing w:before="80" w:after="40"/>
+      </w:pPr>
+      <w:r>
+        <w:rPr>
+          <w:rFonts w:ascii="Calibri" w:hAnsi="Calibri"/>
+          <w:color w:val="FFFFFF"/>
+          <w:sz w:val="22"/>
+        </w:rPr>
+        <w:t>7. Parasitic Diseases</w:t>
+      </w:r>
+    </w:p>
     <w:tbl>
       <w:tblPr>
         <w:tblStyle w:val="TableGrid"/>
@@ -16247,6 +16737,20 @@
       </w:tr>
     </w:tbl>
     <w:p/>
+    <w:p>
+      <w:pPr>
+        <w:pStyle w:val="Heading2"/>
+        <w:spacing w:before="80" w:after="40"/>
+      </w:pPr>
+      <w:r>
+        <w:rPr>
+          <w:rFonts w:ascii="Calibri" w:hAnsi="Calibri"/>
+          <w:color w:val="FFFFFF"/>
+          <w:sz w:val="22"/>
+        </w:rPr>
+        <w:t>8. Zoonotic Risk at Necropsy — Safety Summary</w:t>
+      </w:r>
+    </w:p>
     <w:tbl>
       <w:tblPr>
         <w:tblStyle w:val="TableGrid"/>
@@ -16811,6 +17315,20 @@
         <w:br w:type="page"/>
       </w:r>
     </w:p>
+    <w:p>
+      <w:pPr>
+        <w:pStyle w:val="Heading1"/>
+        <w:spacing w:before="0" w:after="40"/>
+      </w:pPr>
+      <w:r>
+        <w:rPr>
+          <w:rFonts w:ascii="Calibri" w:hAnsi="Calibri"/>
+          <w:color w:val="1B4332"/>
+          <w:sz w:val="28"/>
+        </w:rPr>
+        <w:t>Chapter 4 — Collection of Biological Materials for Wildlife Disease Diagnosis</w:t>
+      </w:r>
+    </w:p>
     <w:tbl>
       <w:tblPr>
         <w:tblStyle w:val="TableGrid"/>
@@ -16881,6 +17399,20 @@
       </w:tr>
     </w:tbl>
     <w:p/>
+    <w:p>
+      <w:pPr>
+        <w:pStyle w:val="Heading2"/>
+        <w:spacing w:before="80" w:after="40"/>
+      </w:pPr>
+      <w:r>
+        <w:rPr>
+          <w:rFonts w:ascii="Calibri" w:hAnsi="Calibri"/>
+          <w:color w:val="FFFFFF"/>
+          <w:sz w:val="22"/>
+        </w:rPr>
+        <w:t>1. Why We Collect Biological Materials</w:t>
+      </w:r>
+    </w:p>
     <w:tbl>
       <w:tblPr>
         <w:tblStyle w:val="TableGrid"/>
@@ -16963,6 +17495,20 @@
       </w:tr>
     </w:tbl>
     <w:p/>
+    <w:p>
+      <w:pPr>
+        <w:pStyle w:val="Heading2"/>
+        <w:spacing w:before="80" w:after="40"/>
+      </w:pPr>
+      <w:r>
+        <w:rPr>
+          <w:rFonts w:ascii="Calibri" w:hAnsi="Calibri"/>
+          <w:color w:val="FFFFFF"/>
+          <w:sz w:val="22"/>
+        </w:rPr>
+        <w:t>2. Master Sample-Collection Table</w:t>
+      </w:r>
+    </w:p>
     <w:tbl>
       <w:tblPr>
         <w:tblStyle w:val="TableGrid"/>
@@ -18703,6 +19249,20 @@
       </w:tr>
     </w:tbl>
     <w:p/>
+    <w:p>
+      <w:pPr>
+        <w:pStyle w:val="Heading2"/>
+        <w:spacing w:before="80" w:after="40"/>
+      </w:pPr>
+      <w:r>
+        <w:rPr>
+          <w:rFonts w:ascii="Calibri" w:hAnsi="Calibri"/>
+          <w:color w:val="FFFFFF"/>
+          <w:sz w:val="22"/>
+        </w:rPr>
+        <w:t>3. 10% Neutral Buffered Formalin (NBF) — Preparation</w:t>
+      </w:r>
+    </w:p>
     <w:tbl>
       <w:tblPr>
         <w:tblStyle w:val="TableGrid"/>
@@ -19105,6 +19665,20 @@
       </w:tr>
     </w:tbl>
     <w:p/>
+    <w:p>
+      <w:pPr>
+        <w:pStyle w:val="Heading2"/>
+        <w:spacing w:before="80" w:after="40"/>
+      </w:pPr>
+      <w:r>
+        <w:rPr>
+          <w:rFonts w:ascii="Calibri" w:hAnsi="Calibri"/>
+          <w:color w:val="FFFFFF"/>
+          <w:sz w:val="22"/>
+        </w:rPr>
+        <w:t>4. Toxicological Sampling</w:t>
+      </w:r>
+    </w:p>
     <w:tbl>
       <w:tblPr>
         <w:tblStyle w:val="TableGrid"/>
@@ -19747,6 +20321,20 @@
       </w:tr>
     </w:tbl>
     <w:p/>
+    <w:p>
+      <w:pPr>
+        <w:pStyle w:val="Heading2"/>
+        <w:spacing w:before="80" w:after="40"/>
+      </w:pPr>
+      <w:r>
+        <w:rPr>
+          <w:rFonts w:ascii="Calibri" w:hAnsi="Calibri"/>
+          <w:color w:val="FFFFFF"/>
+          <w:sz w:val="22"/>
+        </w:rPr>
+        <w:t>5. 10-Step Packing Protocol</w:t>
+      </w:r>
+    </w:p>
     <w:tbl>
       <w:tblPr>
         <w:tblStyle w:val="TableGrid"/>
@@ -19921,6 +20509,20 @@
       </w:r>
     </w:p>
     <w:p/>
+    <w:p>
+      <w:pPr>
+        <w:pStyle w:val="Heading2"/>
+        <w:spacing w:before="80" w:after="40"/>
+      </w:pPr>
+      <w:r>
+        <w:rPr>
+          <w:rFonts w:ascii="Calibri" w:hAnsi="Calibri"/>
+          <w:color w:val="FFFFFF"/>
+          <w:sz w:val="22"/>
+        </w:rPr>
+        <w:t>6. National Referral Laboratories</w:t>
+      </w:r>
+    </w:p>
     <w:tbl>
       <w:tblPr>
         <w:tblStyle w:val="TableGrid"/>
@@ -20276,6 +20878,20 @@
         <w:br w:type="page"/>
       </w:r>
     </w:p>
+    <w:p>
+      <w:pPr>
+        <w:pStyle w:val="Heading1"/>
+        <w:spacing w:before="0" w:after="40"/>
+      </w:pPr>
+      <w:r>
+        <w:rPr>
+          <w:rFonts w:ascii="Calibri" w:hAnsi="Calibri"/>
+          <w:color w:val="1B4332"/>
+          <w:sz w:val="28"/>
+        </w:rPr>
+        <w:t>Chapter 5 — Non-Infectious Diseases in Asian Elephants</w:t>
+      </w:r>
+    </w:p>
     <w:tbl>
       <w:tblPr>
         <w:tblStyle w:val="TableGrid"/>
@@ -20346,6 +20962,20 @@
       </w:tr>
     </w:tbl>
     <w:p/>
+    <w:p>
+      <w:pPr>
+        <w:pStyle w:val="Heading2"/>
+        <w:spacing w:before="80" w:after="40"/>
+      </w:pPr>
+      <w:r>
+        <w:rPr>
+          <w:rFonts w:ascii="Calibri" w:hAnsi="Calibri"/>
+          <w:color w:val="FFFFFF"/>
+          <w:sz w:val="22"/>
+        </w:rPr>
+        <w:t>1. Background — Biological Vulnerability of Elephants</w:t>
+      </w:r>
+    </w:p>
     <w:tbl>
       <w:tblPr>
         <w:tblStyle w:val="TableGrid"/>
@@ -20675,6 +21305,20 @@
       </w:tr>
     </w:tbl>
     <w:p/>
+    <w:p>
+      <w:pPr>
+        <w:pStyle w:val="Heading2"/>
+        <w:spacing w:before="80" w:after="40"/>
+      </w:pPr>
+      <w:r>
+        <w:rPr>
+          <w:rFonts w:ascii="Calibri" w:hAnsi="Calibri"/>
+          <w:color w:val="FFFFFF"/>
+          <w:sz w:val="22"/>
+        </w:rPr>
+        <w:t>2. Case Study — Mass Mortality, Bandhavgarh NP (October 2024)</w:t>
+      </w:r>
+    </w:p>
     <w:tbl>
       <w:tblPr>
         <w:tblStyle w:val="TableGrid"/>
@@ -21357,6 +22001,20 @@
       </w:tr>
     </w:tbl>
     <w:p/>
+    <w:p>
+      <w:pPr>
+        <w:pStyle w:val="Heading2"/>
+        <w:spacing w:before="80" w:after="40"/>
+      </w:pPr>
+      <w:r>
+        <w:rPr>
+          <w:rFonts w:ascii="Calibri" w:hAnsi="Calibri"/>
+          <w:color w:val="FFFFFF"/>
+          <w:sz w:val="22"/>
+        </w:rPr>
+        <w:t>3. Cyclopiazonic Acid (CPA) — Key Facts</w:t>
+      </w:r>
+    </w:p>
     <w:tbl>
       <w:tblPr>
         <w:tblStyle w:val="TableGrid"/>
@@ -21726,6 +22384,20 @@
       </w:tr>
     </w:tbl>
     <w:p/>
+    <w:p>
+      <w:pPr>
+        <w:pStyle w:val="Heading2"/>
+        <w:spacing w:before="80" w:after="40"/>
+      </w:pPr>
+      <w:r>
+        <w:rPr>
+          <w:rFonts w:ascii="Calibri" w:hAnsi="Calibri"/>
+          <w:color w:val="FFFFFF"/>
+          <w:sz w:val="22"/>
+        </w:rPr>
+        <w:t>4. Electrocution</w:t>
+      </w:r>
+    </w:p>
     <w:tbl>
       <w:tblPr>
         <w:tblStyle w:val="TableGrid"/>
@@ -22282,6 +22954,20 @@
       </w:tr>
     </w:tbl>
     <w:p/>
+    <w:p>
+      <w:pPr>
+        <w:pStyle w:val="Heading2"/>
+        <w:spacing w:before="80" w:after="40"/>
+      </w:pPr>
+      <w:r>
+        <w:rPr>
+          <w:rFonts w:ascii="Calibri" w:hAnsi="Calibri"/>
+          <w:color w:val="FFFFFF"/>
+          <w:sz w:val="22"/>
+        </w:rPr>
+        <w:t>5. Lightning Side-Potential (Herd Mortality)</w:t>
+      </w:r>
+    </w:p>
     <w:tbl>
       <w:tblPr>
         <w:tblStyle w:val="TableGrid"/>
@@ -22331,6 +23017,20 @@
         <w:t>When lightning strikes near a herd, ground current radiates in concentric circles. Front and back legs are at different potentials — current flows through the body. Calves and smaller animals are most susceptible. Multiple simultaneous deaths at the same location during/after a storm strongly indicates lightning side-potential.</w:t>
       </w:r>
     </w:p>
+    <w:p>
+      <w:pPr>
+        <w:pStyle w:val="Heading2"/>
+        <w:spacing w:before="80" w:after="40"/>
+      </w:pPr>
+      <w:r>
+        <w:rPr>
+          <w:rFonts w:ascii="Calibri" w:hAnsi="Calibri"/>
+          <w:color w:val="FFFFFF"/>
+          <w:sz w:val="22"/>
+        </w:rPr>
+        <w:t>6. Nutritional Deficiencies</w:t>
+      </w:r>
+    </w:p>
     <w:tbl>
       <w:tblPr>
         <w:tblStyle w:val="TableGrid"/>
@@ -22874,6 +23574,20 @@
       </w:tr>
     </w:tbl>
     <w:p/>
+    <w:p>
+      <w:pPr>
+        <w:pStyle w:val="Heading2"/>
+        <w:spacing w:before="80" w:after="40"/>
+      </w:pPr>
+      <w:r>
+        <w:rPr>
+          <w:rFonts w:ascii="Calibri" w:hAnsi="Calibri"/>
+          <w:color w:val="FFFFFF"/>
+          <w:sz w:val="22"/>
+        </w:rPr>
+        <w:t>7. Field Investigation Framework</w:t>
+      </w:r>
+    </w:p>
     <w:tbl>
       <w:tblPr>
         <w:tblStyle w:val="TableGrid"/>
@@ -23291,6 +24005,20 @@
         <w:br w:type="page"/>
       </w:r>
     </w:p>
+    <w:p>
+      <w:pPr>
+        <w:pStyle w:val="Heading1"/>
+        <w:spacing w:before="0" w:after="40"/>
+      </w:pPr>
+      <w:r>
+        <w:rPr>
+          <w:rFonts w:ascii="Calibri" w:hAnsi="Calibri"/>
+          <w:color w:val="1B4332"/>
+          <w:sz w:val="28"/>
+        </w:rPr>
+        <w:t>Chapter 6 — Non-Infectious Pathology in Asian Elephants</w:t>
+      </w:r>
+    </w:p>
     <w:tbl>
       <w:tblPr>
         <w:tblStyle w:val="TableGrid"/>
@@ -23361,6 +24089,20 @@
       </w:tr>
     </w:tbl>
     <w:p/>
+    <w:p>
+      <w:pPr>
+        <w:pStyle w:val="Heading2"/>
+        <w:spacing w:before="80" w:after="40"/>
+      </w:pPr>
+      <w:r>
+        <w:rPr>
+          <w:rFonts w:ascii="Calibri" w:hAnsi="Calibri"/>
+          <w:color w:val="FFFFFF"/>
+          <w:sz w:val="22"/>
+        </w:rPr>
+        <w:t>1. Routes of Poisoning</w:t>
+      </w:r>
+    </w:p>
     <w:tbl>
       <w:tblPr>
         <w:tblStyle w:val="TableGrid"/>
@@ -23649,6 +24391,20 @@
       </w:tr>
     </w:tbl>
     <w:p/>
+    <w:p>
+      <w:pPr>
+        <w:pStyle w:val="Heading2"/>
+        <w:spacing w:before="80" w:after="40"/>
+      </w:pPr>
+      <w:r>
+        <w:rPr>
+          <w:rFonts w:ascii="Calibri" w:hAnsi="Calibri"/>
+          <w:color w:val="FFFFFF"/>
+          <w:sz w:val="22"/>
+        </w:rPr>
+        <w:t>2. Mycotoxins — CPA &amp; Kodo Millet Pathology</w:t>
+      </w:r>
+    </w:p>
     <w:tbl>
       <w:tblPr>
         <w:tblStyle w:val="TableGrid"/>
@@ -24709,6 +25465,20 @@
       </w:tr>
     </w:tbl>
     <w:p/>
+    <w:p>
+      <w:pPr>
+        <w:pStyle w:val="Heading2"/>
+        <w:spacing w:before="80" w:after="40"/>
+      </w:pPr>
+      <w:r>
+        <w:rPr>
+          <w:rFonts w:ascii="Calibri" w:hAnsi="Calibri"/>
+          <w:color w:val="FFFFFF"/>
+          <w:sz w:val="22"/>
+        </w:rPr>
+        <w:t>3. HCN (Hydrocyanic Acid) Poisoning</w:t>
+      </w:r>
+    </w:p>
     <w:tbl>
       <w:tblPr>
         <w:tblStyle w:val="TableGrid"/>
@@ -25311,6 +26081,20 @@
       </w:tr>
     </w:tbl>
     <w:p/>
+    <w:p>
+      <w:pPr>
+        <w:pStyle w:val="Heading2"/>
+        <w:spacing w:before="80" w:after="40"/>
+      </w:pPr>
+      <w:r>
+        <w:rPr>
+          <w:rFonts w:ascii="Calibri" w:hAnsi="Calibri"/>
+          <w:color w:val="FFFFFF"/>
+          <w:sz w:val="22"/>
+        </w:rPr>
+        <w:t>4. Electrocution — Pathological Terminology</w:t>
+      </w:r>
+    </w:p>
     <w:tbl>
       <w:tblPr>
         <w:tblStyle w:val="TableGrid"/>
@@ -25717,6 +26501,20 @@
       </w:tr>
     </w:tbl>
     <w:p/>
+    <w:p>
+      <w:pPr>
+        <w:pStyle w:val="Heading2"/>
+        <w:spacing w:before="80" w:after="40"/>
+      </w:pPr>
+      <w:r>
+        <w:rPr>
+          <w:rFonts w:ascii="Calibri" w:hAnsi="Calibri"/>
+          <w:color w:val="FFFFFF"/>
+          <w:sz w:val="22"/>
+        </w:rPr>
+        <w:t>5. Pyometra in Female Elephants</w:t>
+      </w:r>
+    </w:p>
     <w:tbl>
       <w:tblPr>
         <w:tblStyle w:val="TableGrid"/>
@@ -26046,6 +26844,20 @@
       </w:tr>
     </w:tbl>
     <w:p/>
+    <w:p>
+      <w:pPr>
+        <w:pStyle w:val="Heading2"/>
+        <w:spacing w:before="80" w:after="40"/>
+      </w:pPr>
+      <w:r>
+        <w:rPr>
+          <w:rFonts w:ascii="Calibri" w:hAnsi="Calibri"/>
+          <w:color w:val="FFFFFF"/>
+          <w:sz w:val="22"/>
+        </w:rPr>
+        <w:t>6. Hyperthermia</w:t>
+      </w:r>
+    </w:p>
     <w:tbl>
       <w:tblPr>
         <w:tblStyle w:val="TableGrid"/>
@@ -26375,6 +27187,20 @@
       </w:tr>
     </w:tbl>
     <w:p/>
+    <w:p>
+      <w:pPr>
+        <w:pStyle w:val="Heading2"/>
+        <w:spacing w:before="80" w:after="40"/>
+      </w:pPr>
+      <w:r>
+        <w:rPr>
+          <w:rFonts w:ascii="Calibri" w:hAnsi="Calibri"/>
+          <w:color w:val="FFFFFF"/>
+          <w:sz w:val="22"/>
+        </w:rPr>
+        <w:t>7. Iron Deficiency Anaemia</w:t>
+      </w:r>
+    </w:p>
     <w:tbl>
       <w:tblPr>
         <w:tblStyle w:val="TableGrid"/>
@@ -26664,6 +27490,20 @@
       </w:tr>
     </w:tbl>
     <w:p/>
+    <w:p>
+      <w:pPr>
+        <w:pStyle w:val="Heading2"/>
+        <w:spacing w:before="80" w:after="40"/>
+      </w:pPr>
+      <w:r>
+        <w:rPr>
+          <w:rFonts w:ascii="Calibri" w:hAnsi="Calibri"/>
+          <w:color w:val="FFFFFF"/>
+          <w:sz w:val="22"/>
+        </w:rPr>
+        <w:t>8. Quick Reference — Non-Infectious Conditions</w:t>
+      </w:r>
+    </w:p>
     <w:tbl>
       <w:tblPr>
         <w:tblStyle w:val="TableGrid"/>
@@ -27429,6 +28269,20 @@
         <w:br w:type="page"/>
       </w:r>
     </w:p>
+    <w:p>
+      <w:pPr>
+        <w:pStyle w:val="Heading1"/>
+        <w:spacing w:before="0" w:after="40"/>
+      </w:pPr>
+      <w:r>
+        <w:rPr>
+          <w:rFonts w:ascii="Calibri" w:hAnsi="Calibri"/>
+          <w:color w:val="1B4332"/>
+          <w:sz w:val="28"/>
+        </w:rPr>
+        <w:t>Chapter 7 — Postmortem Examination of the Asian Elephant</w:t>
+      </w:r>
+    </w:p>
     <w:tbl>
       <w:tblPr>
         <w:tblStyle w:val="TableGrid"/>
@@ -27534,6 +28388,20 @@
       </w:tr>
     </w:tbl>
     <w:p/>
+    <w:p>
+      <w:pPr>
+        <w:pStyle w:val="Heading2"/>
+        <w:spacing w:before="80" w:after="40"/>
+      </w:pPr>
+      <w:r>
+        <w:rPr>
+          <w:rFonts w:ascii="Calibri" w:hAnsi="Calibri"/>
+          <w:color w:val="FFFFFF"/>
+          <w:sz w:val="22"/>
+        </w:rPr>
+        <w:t>1. Key Definitions</w:t>
+      </w:r>
+    </w:p>
     <w:tbl>
       <w:tblPr>
         <w:tblStyle w:val="TableGrid"/>
@@ -28083,6 +28951,20 @@
       </w:r>
     </w:p>
     <w:p/>
+    <w:p>
+      <w:pPr>
+        <w:pStyle w:val="Heading2"/>
+        <w:spacing w:before="80" w:after="40"/>
+      </w:pPr>
+      <w:r>
+        <w:rPr>
+          <w:rFonts w:ascii="Calibri" w:hAnsi="Calibri"/>
+          <w:color w:val="FFFFFF"/>
+          <w:sz w:val="22"/>
+        </w:rPr>
+        <w:t>2. Pre-Necropsy Preparation</w:t>
+      </w:r>
+    </w:p>
     <w:tbl>
       <w:tblPr>
         <w:tblStyle w:val="TableGrid"/>
@@ -28412,6 +29294,20 @@
       </w:tr>
     </w:tbl>
     <w:p/>
+    <w:p>
+      <w:pPr>
+        <w:pStyle w:val="Heading2"/>
+        <w:spacing w:before="80" w:after="40"/>
+      </w:pPr>
+      <w:r>
+        <w:rPr>
+          <w:rFonts w:ascii="Calibri" w:hAnsi="Calibri"/>
+          <w:color w:val="FFFFFF"/>
+          <w:sz w:val="22"/>
+        </w:rPr>
+        <w:t>3. Step-by-Step PM Workflow</w:t>
+      </w:r>
+    </w:p>
     <w:tbl>
       <w:tblPr>
         <w:tblStyle w:val="TableGrid"/>
@@ -29231,6 +30127,20 @@
       </w:tr>
     </w:tbl>
     <w:p/>
+    <w:p>
+      <w:pPr>
+        <w:pStyle w:val="Heading2"/>
+        <w:spacing w:before="80" w:after="40"/>
+      </w:pPr>
+      <w:r>
+        <w:rPr>
+          <w:rFonts w:ascii="Calibri" w:hAnsi="Calibri"/>
+          <w:color w:val="FFFFFF"/>
+          <w:sz w:val="22"/>
+        </w:rPr>
+        <w:t>4. Post-Mortem Changes — TSD Estimation</w:t>
+      </w:r>
+    </w:p>
     <w:tbl>
       <w:tblPr>
         <w:tblStyle w:val="TableGrid"/>
@@ -29598,6 +30508,20 @@
       </w:tr>
     </w:tbl>
     <w:p/>
+    <w:p>
+      <w:pPr>
+        <w:pStyle w:val="Heading2"/>
+        <w:spacing w:before="80" w:after="40"/>
+      </w:pPr>
+      <w:r>
+        <w:rPr>
+          <w:rFonts w:ascii="Calibri" w:hAnsi="Calibri"/>
+          <w:color w:val="FFFFFF"/>
+          <w:sz w:val="22"/>
+        </w:rPr>
+        <w:t>5. Molar Age Estimation Guide</w:t>
+      </w:r>
+    </w:p>
     <w:tbl>
       <w:tblPr>
         <w:tblStyle w:val="TableGrid"/>
@@ -30199,6 +31123,20 @@
       </w:tr>
     </w:tbl>
     <w:p/>
+    <w:p>
+      <w:pPr>
+        <w:pStyle w:val="Heading2"/>
+        <w:spacing w:before="80" w:after="40"/>
+      </w:pPr>
+      <w:r>
+        <w:rPr>
+          <w:rFonts w:ascii="Calibri" w:hAnsi="Calibri"/>
+          <w:color w:val="FFFFFF"/>
+          <w:sz w:val="22"/>
+        </w:rPr>
+        <w:t>6. Instruments &amp; Equipment</w:t>
+      </w:r>
+    </w:p>
     <w:tbl>
       <w:tblPr>
         <w:tblStyle w:val="TableGrid"/>
@@ -30959,6 +31897,20 @@
       </w:tr>
     </w:tbl>
     <w:p/>
+    <w:p>
+      <w:pPr>
+        <w:pStyle w:val="Heading2"/>
+        <w:spacing w:before="80" w:after="40"/>
+      </w:pPr>
+      <w:r>
+        <w:rPr>
+          <w:rFonts w:ascii="Calibri" w:hAnsi="Calibri"/>
+          <w:color w:val="FFFFFF"/>
+          <w:sz w:val="22"/>
+        </w:rPr>
+        <w:t>7. External Examination — 11-Point Checklist</w:t>
+      </w:r>
+    </w:p>
     <w:tbl>
       <w:tblPr>
         <w:tblStyle w:val="TableGrid"/>
@@ -31719,6 +32671,20 @@
       </w:tr>
     </w:tbl>
     <w:p/>
+    <w:p>
+      <w:pPr>
+        <w:pStyle w:val="Heading2"/>
+        <w:spacing w:before="80" w:after="40"/>
+      </w:pPr>
+      <w:r>
+        <w:rPr>
+          <w:rFonts w:ascii="Calibri" w:hAnsi="Calibri"/>
+          <w:color w:val="FFFFFF"/>
+          <w:sz w:val="22"/>
+        </w:rPr>
+        <w:t>8. Lymph Node Survey</w:t>
+      </w:r>
+    </w:p>
     <w:tbl>
       <w:tblPr>
         <w:tblStyle w:val="TableGrid"/>
@@ -32184,6 +33150,20 @@
       </w:tr>
     </w:tbl>
     <w:p/>
+    <w:p>
+      <w:pPr>
+        <w:pStyle w:val="Heading2"/>
+        <w:spacing w:before="80" w:after="40"/>
+      </w:pPr>
+      <w:r>
+        <w:rPr>
+          <w:rFonts w:ascii="Calibri" w:hAnsi="Calibri"/>
+          <w:color w:val="FFFFFF"/>
+          <w:sz w:val="22"/>
+        </w:rPr>
+        <w:t>9. EEHV — Histopathological Findings</w:t>
+      </w:r>
+    </w:p>
     <w:tbl>
       <w:tblPr>
         <w:tblStyle w:val="TableGrid"/>
@@ -32513,6 +33493,20 @@
       </w:tr>
     </w:tbl>
     <w:p/>
+    <w:p>
+      <w:pPr>
+        <w:pStyle w:val="Heading2"/>
+        <w:spacing w:before="80" w:after="40"/>
+      </w:pPr>
+      <w:r>
+        <w:rPr>
+          <w:rFonts w:ascii="Calibri" w:hAnsi="Calibri"/>
+          <w:color w:val="FFFFFF"/>
+          <w:sz w:val="22"/>
+        </w:rPr>
+        <w:t>10. Differential Diagnosis — Key Elephant Deaths</w:t>
+      </w:r>
+    </w:p>
     <w:tbl>
       <w:tblPr>
         <w:tblStyle w:val="TableGrid"/>
@@ -33096,6 +34090,20 @@
       </w:tr>
     </w:tbl>
     <w:p/>
+    <w:p>
+      <w:pPr>
+        <w:pStyle w:val="Heading2"/>
+        <w:spacing w:before="80" w:after="40"/>
+      </w:pPr>
+      <w:r>
+        <w:rPr>
+          <w:rFonts w:ascii="Calibri" w:hAnsi="Calibri"/>
+          <w:color w:val="FFFFFF"/>
+          <w:sz w:val="22"/>
+        </w:rPr>
+        <w:t>11. PM Report — Documentation Checklist</w:t>
+      </w:r>
+    </w:p>
     <w:tbl>
       <w:tblPr>
         <w:tblStyle w:val="TableGrid"/>

</xml_diff>